<commit_message>
docs: balance 18 screens evenly across 5 members (3-4 screens each) and provide mobile direct download guide
</commit_message>
<xml_diff>
--- a/PHAN_CONG_NHIEM_VU_VA_HUONG_DAN_BAO_CAO.docx
+++ b/PHAN_CONG_NHIEM_VU_VA_HUONG_DAN_BAO_CAO.docx
@@ -648,7 +648,7 @@
           <w:color w:val="1B365D"/>
           <w:sz w:val="32"/>
         </w:rPr>
-        <w:t>PHẦN II: BẢNG TỔNG HỢP PHÂN CÔNG NHIỆM VỤ CHO 5 THÀNH VIÊN</w:t>
+        <w:t>PHẦN II: BẢNG TỔNG HỢP PHÂN CÔNG 18 MÀN HÌNH CHO 5 THÀNH VIÊN</w:t>
       </w:r>
     </w:p>
     <w:p>
@@ -665,7 +665,19 @@
         <w:t>18 màn hình (Activity)</w:t>
       </w:r>
       <w:r>
-        <w:t xml:space="preserve"> được phân chia hoàn hảo cho 5 thành viên trong nhóm. Các màn hình có liên quan trực tiếp về nghiệp vụ được gom chung vào một nhóm để các bạn dễ học, dễ trình bày và hỗ trợ lẫn nhau:</w:t>
+        <w:rPr>
+          <w:color w:val="1E293B"/>
+        </w:rPr>
+        <w:t xml:space="preserve"> được phân chia hoàn toàn đồng đều cho 5 thành viên trong nhóm. Theo đúng chuẩn đồ án, </w:t>
+      </w:r>
+      <w:r>
+        <w:rPr>
+          <w:b/>
+        </w:rPr>
+        <w:t>mỗi thành viên đảm nhiệm từ 3 đến 4 màn hình</w:t>
+      </w:r>
+      <w:r>
+        <w:t xml:space="preserve"> cùng các mô-đun chức năng có liên quan mật thiết với nhau:</w:t>
       </w:r>
     </w:p>
     <w:tbl>
@@ -685,7 +697,7 @@
       <w:tr>
         <w:tc>
           <w:tcPr>
-            <w:tcW w:type="dxa" w:w="720"/>
+            <w:tcW w:type="dxa" w:w="576"/>
             <w:shd w:fill="1E3A8A"/>
             <w:tcMar>
               <w:top w:w="100" w:type="dxa"/>
@@ -737,7 +749,7 @@
         </w:tc>
         <w:tc>
           <w:tcPr>
-            <w:tcW w:type="dxa" w:w="2160"/>
+            <w:tcW w:type="dxa" w:w="2016"/>
             <w:shd w:fill="1E3A8A"/>
             <w:tcMar>
               <w:top w:w="100" w:type="dxa"/>
@@ -763,7 +775,7 @@
         </w:tc>
         <w:tc>
           <w:tcPr>
-            <w:tcW w:type="dxa" w:w="2592"/>
+            <w:tcW w:type="dxa" w:w="2880"/>
             <w:shd w:fill="1E3A8A"/>
             <w:tcMar>
               <w:top w:w="100" w:type="dxa"/>
@@ -783,13 +795,13 @@
                 <w:color w:val="FFFFFF"/>
                 <w:sz w:val="19"/>
               </w:rPr>
-              <w:t>Các Màn Hình Đảm Nhiệm (18 Màn Hình)</w:t>
+              <w:t>Các Màn Hình Đảm Nhiệm (Đủ 18 Màn Hình)</w:t>
             </w:r>
           </w:p>
         </w:tc>
         <w:tc>
           <w:tcPr>
-            <w:tcW w:type="dxa" w:w="2304"/>
+            <w:tcW w:type="dxa" w:w="2160"/>
             <w:shd w:fill="1E3A8A"/>
             <w:tcMar>
               <w:top w:w="100" w:type="dxa"/>
@@ -835,7 +847,7 @@
                 <w:color w:val="FFFFFF"/>
                 <w:sz w:val="19"/>
               </w:rPr>
-              <w:t>Tỷ Lệ</w:t>
+              <w:t>Số Màn</w:t>
             </w:r>
           </w:p>
         </w:tc>
@@ -843,7 +855,7 @@
       <w:tr>
         <w:tc>
           <w:tcPr>
-            <w:tcW w:type="dxa" w:w="720"/>
+            <w:tcW w:type="dxa" w:w="576"/>
             <w:shd w:fill="FFFFFF"/>
             <w:tcMar>
               <w:top w:w="80" w:type="dxa"/>
@@ -893,7 +905,7 @@
         </w:tc>
         <w:tc>
           <w:tcPr>
-            <w:tcW w:type="dxa" w:w="2160"/>
+            <w:tcW w:type="dxa" w:w="2016"/>
             <w:shd w:fill="FFFFFF"/>
             <w:tcMar>
               <w:top w:w="80" w:type="dxa"/>
@@ -917,7 +929,7 @@
         </w:tc>
         <w:tc>
           <w:tcPr>
-            <w:tcW w:type="dxa" w:w="2592"/>
+            <w:tcW w:type="dxa" w:w="2880"/>
             <w:shd w:fill="FFFFFF"/>
             <w:tcMar>
               <w:top w:w="80" w:type="dxa"/>
@@ -935,19 +947,19 @@
                 <w:rFonts w:ascii="Arial" w:hAnsi="Arial"/>
                 <w:sz w:val="18"/>
               </w:rPr>
-              <w:t>1. LoginActivity</w:t>
+              <w:t>Màn 1: LoginActivity (Đăng nhập)</w:t>
               <w:br/>
-              <w:t>2. RegisterActivity</w:t>
+              <w:t>Màn 2: RegisterActivity (Đăng ký)</w:t>
               <w:br/>
-              <w:t>3. UserProfileActivity</w:t>
+              <w:t>Màn 3: UserProfileActivity (Hồ sơ cá nhân)</w:t>
               <w:br/>
-              <w:t>4. UserManagementActivity</w:t>
+              <w:t>Màn 4: UserManagementActivity (Quản lý User)</w:t>
             </w:r>
           </w:p>
         </w:tc>
         <w:tc>
           <w:tcPr>
-            <w:tcW w:type="dxa" w:w="2304"/>
+            <w:tcW w:type="dxa" w:w="2160"/>
             <w:shd w:fill="FFFFFF"/>
             <w:tcMar>
               <w:top w:w="80" w:type="dxa"/>
@@ -997,9 +1009,10 @@
             <w:r>
               <w:rPr>
                 <w:rFonts w:ascii="Arial" w:hAnsi="Arial"/>
+                <w:b/>
                 <w:sz w:val="18"/>
               </w:rPr>
-              <w:t>20%</w:t>
+              <w:t>4 màn</w:t>
             </w:r>
           </w:p>
         </w:tc>
@@ -1007,7 +1020,7 @@
       <w:tr>
         <w:tc>
           <w:tcPr>
-            <w:tcW w:type="dxa" w:w="720"/>
+            <w:tcW w:type="dxa" w:w="576"/>
             <w:shd w:fill="F8FAFC"/>
             <w:tcMar>
               <w:top w:w="80" w:type="dxa"/>
@@ -1057,7 +1070,7 @@
         </w:tc>
         <w:tc>
           <w:tcPr>
-            <w:tcW w:type="dxa" w:w="2160"/>
+            <w:tcW w:type="dxa" w:w="2016"/>
             <w:shd w:fill="F8FAFC"/>
             <w:tcMar>
               <w:top w:w="80" w:type="dxa"/>
@@ -1075,13 +1088,13 @@
                 <w:rFonts w:ascii="Arial" w:hAnsi="Arial"/>
                 <w:sz w:val="18"/>
               </w:rPr>
-              <w:t>Dữ liệu Khí tượng, Dự báo &amp; Thiên văn</w:t>
+              <w:t>Dữ liệu Khí tượng &amp; Dự báo Thời tiết</w:t>
             </w:r>
           </w:p>
         </w:tc>
         <w:tc>
           <w:tcPr>
-            <w:tcW w:type="dxa" w:w="2592"/>
+            <w:tcW w:type="dxa" w:w="2880"/>
             <w:shd w:fill="F8FAFC"/>
             <w:tcMar>
               <w:top w:w="80" w:type="dxa"/>
@@ -1099,21 +1112,19 @@
                 <w:rFonts w:ascii="Arial" w:hAnsi="Arial"/>
                 <w:sz w:val="18"/>
               </w:rPr>
-              <w:t>5. MainActivity</w:t>
+              <w:t>Màn 5: MainActivity (Trang chủ thời tiết)</w:t>
               <w:br/>
-              <w:t>6. HourlyForecastActivity</w:t>
+              <w:t>Màn 6: HourlyForecastActivity (Dự báo 24 giờ)</w:t>
               <w:br/>
-              <w:t>7. Forecast3DaysActivity</w:t>
+              <w:t>Màn 7: Forecast3DaysActivity (Dự báo 3 ngày)</w:t>
               <w:br/>
-              <w:t>8. ForecastActivity</w:t>
-              <w:br/>
-              <w:t>9. SunMoonActivity</w:t>
+              <w:t>Màn 8: ForecastActivity (Dự báo 7 ngày)</w:t>
             </w:r>
           </w:p>
         </w:tc>
         <w:tc>
           <w:tcPr>
-            <w:tcW w:type="dxa" w:w="2304"/>
+            <w:tcW w:type="dxa" w:w="2160"/>
             <w:shd w:fill="F8FAFC"/>
             <w:tcMar>
               <w:top w:w="80" w:type="dxa"/>
@@ -1139,11 +1150,11 @@
               <w:br/>
               <w:t>ForecastActivity.java</w:t>
               <w:br/>
-              <w:t>SunMoonActivity.java</w:t>
-              <w:br/>
               <w:t>activity_main.xml</w:t>
               <w:br/>
               <w:t>item_hourly_forecast.xml</w:t>
+              <w:br/>
+              <w:t>item_forecast.xml</w:t>
             </w:r>
           </w:p>
         </w:tc>
@@ -1165,9 +1176,10 @@
             <w:r>
               <w:rPr>
                 <w:rFonts w:ascii="Arial" w:hAnsi="Arial"/>
+                <w:b/>
                 <w:sz w:val="18"/>
               </w:rPr>
-              <w:t>20%</w:t>
+              <w:t>4 màn</w:t>
             </w:r>
           </w:p>
         </w:tc>
@@ -1175,7 +1187,7 @@
       <w:tr>
         <w:tc>
           <w:tcPr>
-            <w:tcW w:type="dxa" w:w="720"/>
+            <w:tcW w:type="dxa" w:w="576"/>
             <w:shd w:fill="FFFFFF"/>
             <w:tcMar>
               <w:top w:w="80" w:type="dxa"/>
@@ -1225,7 +1237,7 @@
         </w:tc>
         <w:tc>
           <w:tcPr>
-            <w:tcW w:type="dxa" w:w="2160"/>
+            <w:tcW w:type="dxa" w:w="2016"/>
             <w:shd w:fill="FFFFFF"/>
             <w:tcMar>
               <w:top w:w="80" w:type="dxa"/>
@@ -1243,13 +1255,13 @@
                 <w:rFonts w:ascii="Arial" w:hAnsi="Arial"/>
                 <w:sz w:val="18"/>
               </w:rPr>
-              <w:t>Định vị Vệ tinh GPS &amp; Tra cứu Địa danh</w:t>
+              <w:t>Định vị GPS, Tra cứu &amp; Thiên văn Tọa độ</w:t>
             </w:r>
           </w:p>
         </w:tc>
         <w:tc>
           <w:tcPr>
-            <w:tcW w:type="dxa" w:w="2592"/>
+            <w:tcW w:type="dxa" w:w="2880"/>
             <w:shd w:fill="FFFFFF"/>
             <w:tcMar>
               <w:top w:w="80" w:type="dxa"/>
@@ -1267,15 +1279,17 @@
                 <w:rFonts w:ascii="Arial" w:hAnsi="Arial"/>
                 <w:sz w:val="18"/>
               </w:rPr>
-              <w:t>10. CurrentLocationActivity</w:t>
+              <w:t>Màn 9: CurrentLocationActivity (Định vị GPS)</w:t>
               <w:br/>
-              <w:t>11. SearchLocationActivity</w:t>
+              <w:t>Màn 10: SearchLocationActivity (Tìm kiếm 63 tỉnh)</w:t>
+              <w:br/>
+              <w:t>Màn 11: SunMoonActivity (Thiên văn Mặt Trời/Trăng)</w:t>
             </w:r>
           </w:p>
         </w:tc>
         <w:tc>
           <w:tcPr>
-            <w:tcW w:type="dxa" w:w="2304"/>
+            <w:tcW w:type="dxa" w:w="2160"/>
             <w:shd w:fill="FFFFFF"/>
             <w:tcMar>
               <w:top w:w="80" w:type="dxa"/>
@@ -1297,13 +1311,15 @@
               <w:br/>
               <w:t>SearchLocationActivity.java</w:t>
               <w:br/>
+              <w:t>SunMoonActivity.java</w:t>
+              <w:br/>
               <w:t>LocationHelper.java</w:t>
               <w:br/>
               <w:t>VietnamLocations.java</w:t>
               <w:br/>
               <w:t>SearchSuggestionAdapter.java</w:t>
               <w:br/>
-              <w:t>DatabaseHelper.java (bảng search_history)</w:t>
+              <w:t>DatabaseHelper.java (search_history)</w:t>
             </w:r>
           </w:p>
         </w:tc>
@@ -1325,9 +1341,10 @@
             <w:r>
               <w:rPr>
                 <w:rFonts w:ascii="Arial" w:hAnsi="Arial"/>
+                <w:b/>
                 <w:sz w:val="18"/>
               </w:rPr>
-              <w:t>20%</w:t>
+              <w:t>3 màn</w:t>
             </w:r>
           </w:p>
         </w:tc>
@@ -1335,7 +1352,7 @@
       <w:tr>
         <w:tc>
           <w:tcPr>
-            <w:tcW w:type="dxa" w:w="720"/>
+            <w:tcW w:type="dxa" w:w="576"/>
             <w:shd w:fill="F8FAFC"/>
             <w:tcMar>
               <w:top w:w="80" w:type="dxa"/>
@@ -1385,7 +1402,7 @@
         </w:tc>
         <w:tc>
           <w:tcPr>
-            <w:tcW w:type="dxa" w:w="2160"/>
+            <w:tcW w:type="dxa" w:w="2016"/>
             <w:shd w:fill="F8FAFC"/>
             <w:tcMar>
               <w:top w:w="80" w:type="dxa"/>
@@ -1403,13 +1420,13 @@
                 <w:rFonts w:ascii="Arial" w:hAnsi="Arial"/>
                 <w:sz w:val="18"/>
               </w:rPr>
-              <w:t>So sánh Khí hậu &amp; Cảnh báo Thiên tai</w:t>
+              <w:t>So sánh Khí hậu, Chi tiết &amp; Thiên tai</w:t>
             </w:r>
           </w:p>
         </w:tc>
         <w:tc>
           <w:tcPr>
-            <w:tcW w:type="dxa" w:w="2592"/>
+            <w:tcW w:type="dxa" w:w="2880"/>
             <w:shd w:fill="F8FAFC"/>
             <w:tcMar>
               <w:top w:w="80" w:type="dxa"/>
@@ -1427,17 +1444,19 @@
                 <w:rFonts w:ascii="Arial" w:hAnsi="Arial"/>
                 <w:sz w:val="18"/>
               </w:rPr>
-              <w:t>12. WeatherCompareActivity</w:t>
+              <w:t>Màn 12: WeatherCompareActivity (So sánh 2 nơi)</w:t>
               <w:br/>
-              <w:t>13. WeatherAlertsActivity</w:t>
+              <w:t>Màn 13: WeatherAlertsActivity (Cảnh báo thiên tai)</w:t>
               <w:br/>
-              <w:t>14. DisasterGuideActivity</w:t>
+              <w:t>Màn 14: DisasterGuideActivity (Cẩm nang sinh tồn)</w:t>
+              <w:br/>
+              <w:t>Màn 15: DetailActivity (Chi tiết khí tượng)</w:t>
             </w:r>
           </w:p>
         </w:tc>
         <w:tc>
           <w:tcPr>
-            <w:tcW w:type="dxa" w:w="2304"/>
+            <w:tcW w:type="dxa" w:w="2160"/>
             <w:shd w:fill="F8FAFC"/>
             <w:tcMar>
               <w:top w:w="80" w:type="dxa"/>
@@ -1460,6 +1479,8 @@
               <w:t>WeatherAlertsActivity.java</w:t>
               <w:br/>
               <w:t>DisasterGuideActivity.java</w:t>
+              <w:br/>
+              <w:t>DetailActivity.java</w:t>
               <w:br/>
               <w:t>activity_weather_compare.xml</w:t>
               <w:br/>
@@ -1487,9 +1508,10 @@
             <w:r>
               <w:rPr>
                 <w:rFonts w:ascii="Arial" w:hAnsi="Arial"/>
+                <w:b/>
                 <w:sz w:val="18"/>
               </w:rPr>
-              <w:t>20%</w:t>
+              <w:t>4 màn</w:t>
             </w:r>
           </w:p>
         </w:tc>
@@ -1497,7 +1519,7 @@
       <w:tr>
         <w:tc>
           <w:tcPr>
-            <w:tcW w:type="dxa" w:w="720"/>
+            <w:tcW w:type="dxa" w:w="576"/>
             <w:shd w:fill="FFFFFF"/>
             <w:tcMar>
               <w:top w:w="80" w:type="dxa"/>
@@ -1547,7 +1569,7 @@
         </w:tc>
         <w:tc>
           <w:tcPr>
-            <w:tcW w:type="dxa" w:w="2160"/>
+            <w:tcW w:type="dxa" w:w="2016"/>
             <w:shd w:fill="FFFFFF"/>
             <w:tcMar>
               <w:top w:w="80" w:type="dxa"/>
@@ -1565,13 +1587,13 @@
                 <w:rFonts w:ascii="Arial" w:hAnsi="Arial"/>
                 <w:sz w:val="18"/>
               </w:rPr>
-              <w:t>Chất lượng Không khí, Sức khỏe &amp; Cài đặt Hệ thống</w:t>
+              <w:t>Chất lượng Không khí, Sức khỏe &amp; Cài đặt</w:t>
             </w:r>
           </w:p>
         </w:tc>
         <w:tc>
           <w:tcPr>
-            <w:tcW w:type="dxa" w:w="2592"/>
+            <w:tcW w:type="dxa" w:w="2880"/>
             <w:shd w:fill="FFFFFF"/>
             <w:tcMar>
               <w:top w:w="80" w:type="dxa"/>
@@ -1589,19 +1611,17 @@
                 <w:rFonts w:ascii="Arial" w:hAnsi="Arial"/>
                 <w:sz w:val="18"/>
               </w:rPr>
-              <w:t>15. AirQualityActivity</w:t>
+              <w:t>Màn 16: AirQualityActivity (Không khí AQI)</w:t>
               <w:br/>
-              <w:t>16. LifestyleAdviceActivity</w:t>
+              <w:t>Màn 17: LifestyleAdviceActivity (Trợ lý sinh hoạt)</w:t>
               <w:br/>
-              <w:t>17. DetailActivity</w:t>
-              <w:br/>
-              <w:t>18. SettingsActivity</w:t>
+              <w:t>Màn 18: SettingsActivity (Cài đặt hệ thống)</w:t>
             </w:r>
           </w:p>
         </w:tc>
         <w:tc>
           <w:tcPr>
-            <w:tcW w:type="dxa" w:w="2304"/>
+            <w:tcW w:type="dxa" w:w="2160"/>
             <w:shd w:fill="FFFFFF"/>
             <w:tcMar>
               <w:top w:w="80" w:type="dxa"/>
@@ -1623,13 +1643,11 @@
               <w:br/>
               <w:t>LifestyleAdviceActivity.java</w:t>
               <w:br/>
-              <w:t>DetailActivity.java</w:t>
-              <w:br/>
               <w:t>SettingsActivity.java</w:t>
               <w:br/>
-              <w:t>BaseActivity.java</w:t>
+              <w:t>BaseActivity.java (Kiến trúc nền)</w:t>
               <w:br/>
-              <w:t>WeatherUtils.java</w:t>
+              <w:t>WeatherUtils.java (Bộ tiện ích C/F)</w:t>
             </w:r>
           </w:p>
         </w:tc>
@@ -1651,9 +1669,10 @@
             <w:r>
               <w:rPr>
                 <w:rFonts w:ascii="Arial" w:hAnsi="Arial"/>
+                <w:b/>
                 <w:sz w:val="18"/>
               </w:rPr>
-              <w:t>20%</w:t>
+              <w:t>3 màn</w:t>
             </w:r>
           </w:p>
         </w:tc>
@@ -1979,7 +1998,7 @@
           <w:color w:val="2A52BE"/>
           <w:sz w:val="26"/>
         </w:rPr>
-        <w:t>2. Thành Viên 2: BẠN HẰNG NGA — Phụ Trách Dữ Liệu Khí Tượng, Dự Báo &amp; Thiên Văn</w:t>
+        <w:t>2. Thành Viên 2: BẠN HẰNG NGA — Phụ Trách Dữ Liệu Khí Tượng &amp; Dự Báo (4 Màn Hình)</w:t>
       </w:r>
     </w:p>
     <w:p>
@@ -1990,7 +2009,7 @@
         <w:t xml:space="preserve">Vai trò chính: </w:t>
       </w:r>
       <w:r>
-        <w:t>Chịu trách nhiệm kết nối mạng với máy chủ WeatherAPI, bóc tách chuỗi JSON trả về và tổ chức hiển thị trực quan các mô hình dự báo thời gian (theo giờ, 3 ngày, 7 ngày) và dữ liệu thiên văn học.</w:t>
+        <w:t>Chịu trách nhiệm kết nối mạng với máy chủ WeatherAPI, bóc tách chuỗi JSON trả về và tổ chức hiển thị trực quan các mô hình dự báo thời gian (theo giờ, 3 ngày, 7 ngày).</w:t>
       </w:r>
     </w:p>
     <w:p>
@@ -1998,14 +2017,14 @@
         <w:rPr>
           <w:b/>
         </w:rPr>
-        <w:t>Chi tiết 5 màn hình đảm nhiệm:</w:t>
+        <w:t>Chi tiết 4 màn hình đảm nhiệm (Màn 5 -&gt; Màn 8):</w:t>
         <w:br/>
       </w:r>
       <w:r>
         <w:rPr>
           <w:b/>
         </w:rPr>
-        <w:t xml:space="preserve"> 1. MainActivity (Màn hình Trang Chủ Thời Tiết): </w:t>
+        <w:t xml:space="preserve"> • Màn 5: MainActivity (Trang Chủ Thời Tiết): </w:t>
       </w:r>
       <w:r>
         <w:t>Màn hình quan trọng nhất của app. Hiển thị nhiệt độ hiện tại, trạng thái bầu trời (nắng, mưa, nhiều mây), nhiệt độ cảm nhận thực tế, biên độ nhiệt độ Cao nhất - Thấp nhất trong ngày. Tích hợp thanh vuốt từ trên xuống để làm mới dữ liệu (SwipeRefreshLayout) và thanh điều hướng truy cập nhanh các tính năng.</w:t>
@@ -2015,7 +2034,7 @@
         <w:rPr>
           <w:b/>
         </w:rPr>
-        <w:t xml:space="preserve"> 2. HourlyForecastActivity (Dự Báo 24 Giờ Tiếp Theo): </w:t>
+        <w:t xml:space="preserve"> • Màn 6: HourlyForecastActivity (Dự Báo 24 Giờ Tiếp Theo): </w:t>
       </w:r>
       <w:r>
         <w:t>Hiển thị bảng cuộn 24 mốc thời gian trong ngày tới. Cung cấp: Mốc giờ (VD: 14:00, 15:00), Biểu tượng thời tiết, Nhiệt độ dự báo và Khả năng có mưa (%).</w:t>
@@ -2025,7 +2044,7 @@
         <w:rPr>
           <w:b/>
         </w:rPr>
-        <w:t xml:space="preserve"> 3. Forecast3DaysActivity (Dự Báo 3 Ngày Tới): </w:t>
+        <w:t xml:space="preserve"> • Màn 7: Forecast3DaysActivity (Dự Báo 3 Ngày Tới): </w:t>
       </w:r>
       <w:r>
         <w:t>Mô hình dự báo ngắn hạn 3 ngày kế tiếp (Hôm nay, Ngày mai, Ngày kia) với lượng mưa tích lũy và tốc độ gió trung bình.</w:t>
@@ -2035,20 +2054,10 @@
         <w:rPr>
           <w:b/>
         </w:rPr>
-        <w:t xml:space="preserve"> 4. ForecastActivity (Dự Báo Xu Hướng 7 Ngày): </w:t>
+        <w:t xml:space="preserve"> • Màn 8: ForecastActivity (Dự Báo Xu Hướng 7 Ngày): </w:t>
       </w:r>
       <w:r>
         <w:t>Mô hình dự báo trung hạn cả tuần phục vụ người dùng lên kế hoạch đi du lịch, công tác dài ngày.</w:t>
-        <w:br/>
-      </w:r>
-      <w:r>
-        <w:rPr>
-          <w:b/>
-        </w:rPr>
-        <w:t xml:space="preserve"> 5. SunMoonActivity (Màn hình Thiên Văn Mặt Trời &amp; Mặt Trăng): </w:t>
-      </w:r>
-      <w:r>
-        <w:t>Cung cấp giờ Mặt trời mọc (Sunrise), Mặt trời lặn (Sunset), Mặt trăng mọc (Moonrise), Mặt trăng lặn (Moonset), Tuần trăng (Moon Phase) và Tỷ lệ chiếu sáng mặt trăng (Moon Illumination %).</w:t>
       </w:r>
     </w:p>
     <w:p>
@@ -2141,87 +2150,6 @@
         <w:spacing w:before="40" w:after="40"/>
       </w:pPr>
     </w:p>
-    <w:p>
-      <w:r>
-        <w:t xml:space="preserve"> • Bóc tách dữ liệu JSON (JSON Parsing):</w:t>
-        <w:br/>
-      </w:r>
-    </w:p>
-    <w:p>
-      <w:pPr>
-        <w:spacing w:before="80" w:after="120"/>
-        <w:ind w:left="360" w:right="360"/>
-      </w:pPr>
-    </w:p>
-    <w:tbl>
-      <w:tblPr>
-        <w:tblW w:type="auto" w:w="0"/>
-        <w:jc w:val="center"/>
-        <w:tblLook w:firstColumn="1" w:firstRow="1" w:lastColumn="0" w:lastRow="0" w:noHBand="0" w:noVBand="1" w:val="04A0"/>
-      </w:tblPr>
-      <w:tblGrid>
-        <w:gridCol w:w="9648"/>
-      </w:tblGrid>
-      <w:tr>
-        <w:tc>
-          <w:tcPr>
-            <w:tcW w:type="dxa" w:w="9648"/>
-            <w:shd w:fill="F1F5F9"/>
-            <w:tcMar>
-              <w:top w:w="120" w:type="dxa"/>
-              <w:bottom w:w="120" w:type="dxa"/>
-              <w:left w:w="180" w:type="dxa"/>
-              <w:right w:w="180" w:type="dxa"/>
-            </w:tcMar>
-            <w:tcBorders>
-              <w:top w:val="single" w:sz="4" w:space="0" w:color="CBD5E1"/>
-              <w:left w:val="single" w:sz="24" w:space="0" w:color="3B82F6"/>
-              <w:bottom w:val="single" w:sz="4" w:space="0" w:color="CBD5E1"/>
-              <w:right w:val="single" w:sz="4" w:space="0" w:color="CBD5E1"/>
-            </w:tcBorders>
-          </w:tcPr>
-          <w:p>
-            <w:pPr>
-              <w:spacing w:before="0" w:after="0"/>
-            </w:pPr>
-            <w:r>
-              <w:rPr>
-                <w:rFonts w:ascii="Consolas" w:hAnsi="Consolas"/>
-                <w:color w:val="0F172A"/>
-                <w:sz w:val="19"/>
-              </w:rPr>
-              <w:t>JSONObject root = new JSONObject(jsonData);</w:t>
-              <w:br/>
-              <w:t>// 1. Dữ liệu thời tiết hiện tại:</w:t>
-              <w:br/>
-              <w:t>JSONObject current = root.getJSONObject("current");</w:t>
-              <w:br/>
-              <w:t>double tempC = current.getDouble("temp_c");</w:t>
-              <w:br/>
-              <w:t>String conditionText = current.getJSONObject("condition").getString("text");</w:t>
-              <w:br/>
-              <w:br/>
-              <w:t>// 2. Dữ liệu thiên văn mặt trời / mặt trăng:</w:t>
-              <w:br/>
-              <w:t>JSONObject astro = root.getJSONObject("forecast")</w:t>
-              <w:br/>
-              <w:t xml:space="preserve">                       .getJSONArray("forecastday").getJSONObject(0)</w:t>
-              <w:br/>
-              <w:t xml:space="preserve">                       .getJSONObject("astro");</w:t>
-              <w:br/>
-              <w:t>String sunrise = astro.getString("sunrise");</w:t>
-              <w:br/>
-              <w:t>String moonPhase = astro.getString("moon_phase");</w:t>
-            </w:r>
-          </w:p>
-        </w:tc>
-      </w:tr>
-    </w:tbl>
-    <w:p>
-      <w:pPr>
-        <w:spacing w:before="40" w:after="40"/>
-      </w:pPr>
-    </w:p>
     <w:tbl>
       <w:tblPr>
         <w:tblW w:type="auto" w:w="0"/>
@@ -2269,7 +2197,7 @@
                 <w:color w:val="1E293B"/>
                 <w:sz w:val="20"/>
               </w:rPr>
-              <w:t>"Thưa thầy cô, em đảm nhiệm mảng kết nối và xử lý dữ liệu khí tượng trực tuyến từ dịch vụ thời tiết quốc tế WeatherAPI. Em sử dụng thư viện OkHttpClient để gọi API bất đồng bộ (Asynchronous Network Call) giúp giao diện ứng dụng luôn mượt mà, không bao giờ bị đơ hay giật lag khi tải mạng. Toàn bộ dữ liệu JSON trả về được em bóc tách và đổ vào các danh sách RecyclerView để người dùng dễ dàng theo dõi dự báo chi tiết theo từng giờ, 3 ngày, 7 ngày và dữ liệu chu kỳ thiên văn học."</w:t>
+              <w:t>"Thưa thầy cô, em đảm nhiệm mảng kết nối và xử lý dữ liệu khí tượng trực tuyến từ dịch vụ thời tiết quốc tế WeatherAPI. Em sử dụng thư viện OkHttpClient để gọi API bất đồng bộ (Asynchronous Network Call) giúp giao diện ứng dụng luôn mượt mà. Toàn bộ dữ liệu JSON trả về được em bóc tách và đổ vào các danh sách RecyclerView để người dùng dễ dàng theo dõi dự báo chi tiết theo từng giờ, 3 ngày và 7 ngày."</w:t>
             </w:r>
           </w:p>
         </w:tc>
@@ -2292,7 +2220,7 @@
           <w:color w:val="2A52BE"/>
           <w:sz w:val="26"/>
         </w:rPr>
-        <w:t>3. Thành Viên 3: BẠN THÙY TRANG — Phụ Trách Định Vị Vệ Tinh GPS &amp; Tra Cứu Địa Danh</w:t>
+        <w:t>3. Thành Viên 3: BẠN THÙY TRANG — Phụ Trách Định Vị GPS, Tra Cứu &amp; Thiên Văn Tọa Độ (3 Màn Hình)</w:t>
       </w:r>
     </w:p>
     <w:p>
@@ -2303,7 +2231,7 @@
         <w:t xml:space="preserve">Vai trò chính: </w:t>
       </w:r>
       <w:r>
-        <w:t>Xây dựng mô-đun định vị phần cứng GPS, thuật toán chuẩn hóa địa danh chống lỗi trạm vi khí hậu và hệ thống tra cứu thông minh toàn bộ 63 tỉnh thành Việt Nam.</w:t>
+        <w:t>Xây dựng mô-đun định vị phần cứng GPS, thuật toán chuẩn hóa địa danh chống lỗi trạm vi khí hậu, hệ thống tra cứu thông minh 63 tỉnh thành Việt Nam và tính toán thiên văn học mặt trời mặt trăng theo tọa độ địa lý.</w:t>
       </w:r>
     </w:p>
     <w:p>
@@ -2311,27 +2239,37 @@
         <w:rPr>
           <w:b/>
         </w:rPr>
-        <w:t>Chi tiết 2 màn hình lớn chuyên sâu đảm nhiệm:</w:t>
+        <w:t>Chi tiết 3 màn hình đảm nhiệm (Màn 9 -&gt; Màn 11):</w:t>
         <w:br/>
       </w:r>
       <w:r>
         <w:rPr>
           <w:b/>
         </w:rPr>
-        <w:t xml:space="preserve"> 1. CurrentLocationActivity (Màn hình Định Vị Radar GPS Vệ Tinh): </w:t>
+        <w:t xml:space="preserve"> • Màn 9: CurrentLocationActivity (Định Vị Radar GPS Vệ Tinh): </w:t>
       </w:r>
       <w:r>
-        <w:t>Tự động kết nối phần cứng GPS của điện thoại để lấy tọa độ Vĩ độ (Latitude) và Kinh độ (Longitude) thời gian thực. Hiển thị la bàn tọa độ, độ chính xác của tín hiệu vệ tinh (Accuracy tính bằng mét), thời gian chốt vị trí gần nhất. Áp dụng thuật toán Reverse Geocoding chuẩn hóa để hiển thị đúng tên Thành phố trung tâm.</w:t>
+        <w:t>Tự động kết nối phần cứng GPS của điện thoại để lấy tọa độ Vĩ độ và Kinh độ thời gian thực. Hiển thị la bàn tọa độ, độ chính xác vệ tinh (Accuracy tính bằng mét), thời gian chốt vị trí gần nhất. Áp dụng thuật toán Reverse Geocoding chuẩn hóa để hiển thị đúng tên Thành phố trung tâm.</w:t>
         <w:br/>
       </w:r>
       <w:r>
         <w:rPr>
           <w:b/>
         </w:rPr>
-        <w:t xml:space="preserve"> 2. SearchLocationActivity (Màn hình Tra Cứu 63 Tỉnh Thành Toàn Quốc): </w:t>
+        <w:t xml:space="preserve"> • Màn 10: SearchLocationActivity (Tra Cứu 63 Tỉnh Thành Toàn Quốc): </w:t>
       </w:r>
       <w:r>
-        <w:t>Thanh tìm kiếm thông minh tự động gợi ý danh sách địa phương ngay khi người dùng gõ phím. Hỗ trợ tìm kiếm tiếng Việt toàn diện (gõ không dấu như 'da nang', 'tp hcm' hay có dấu như 'Đà Nẵng', 'Hà Nội' đều ra kết quả chuẩn 100%). Cung cấp các nút chọn nhanh (Quick Chips) các đô thị lớn. Quản lý lịch sử tra cứu gần đây (lưu trong bảng SQLite search_history, hỗ trợ xóa từng mục hoặc xóa sạch lịch sử).</w:t>
+        <w:t>Thanh tìm kiếm thông minh gợi ý danh sách địa phương ngay khi gõ phím. Hỗ trợ tìm kiếm tiếng Việt toàn diện (gõ không dấu như 'da nang' hay có dấu như 'Đà Nẵng' đều ra chuẩn 100%). Quản lý lịch sử tra cứu gần đây (lưu trong bảng SQLite search_history).</w:t>
+        <w:br/>
+      </w:r>
+      <w:r>
+        <w:rPr>
+          <w:b/>
+        </w:rPr>
+        <w:t xml:space="preserve"> • Màn 11: SunMoonActivity (Thiên Văn Học Mặt Trời &amp; Mặt Trăng): </w:t>
+      </w:r>
+      <w:r>
+        <w:t>Dựa trên tọa độ kinh vĩ độ của địa phương đã chốt vị trí, hệ thống tính toán chính xác giờ Mặt trời mọc (Sunrise), Mặt trời lặn (Sunset), Mặt trăng mọc (Moonrise), Mặt trăng lặn (Moonset), Tuần trăng (Moon Phase) và Tỷ lệ chiếu sáng mặt trăng (Moon Illumination %).</w:t>
       </w:r>
     </w:p>
     <w:p>
@@ -2404,81 +2342,11 @@
               <w:br/>
               <w:t xml:space="preserve">            double lon = location.getLongitude();</w:t>
               <w:br/>
-              <w:t xml:space="preserve">            // Chuyển tọa độ thành dữ liệu thời tiết</w:t>
-              <w:br/>
               <w:t xml:space="preserve">            callback.onLocationReceived(lat, lon);</w:t>
               <w:br/>
               <w:t xml:space="preserve">        }</w:t>
               <w:br/>
               <w:t xml:space="preserve">    });</w:t>
-              <w:br/>
-              <w:t>}</w:t>
-            </w:r>
-          </w:p>
-        </w:tc>
-      </w:tr>
-    </w:tbl>
-    <w:p>
-      <w:pPr>
-        <w:spacing w:before="40" w:after="40"/>
-      </w:pPr>
-    </w:p>
-    <w:p>
-      <w:r>
-        <w:t xml:space="preserve"> • Thuật toán chuẩn hóa khử dấu tiếng Việt trong VietnamLocations.java:</w:t>
-        <w:br/>
-      </w:r>
-    </w:p>
-    <w:p>
-      <w:pPr>
-        <w:spacing w:before="80" w:after="120"/>
-        <w:ind w:left="360" w:right="360"/>
-      </w:pPr>
-    </w:p>
-    <w:tbl>
-      <w:tblPr>
-        <w:tblW w:type="auto" w:w="0"/>
-        <w:jc w:val="center"/>
-        <w:tblLook w:firstColumn="1" w:firstRow="1" w:lastColumn="0" w:lastRow="0" w:noHBand="0" w:noVBand="1" w:val="04A0"/>
-      </w:tblPr>
-      <w:tblGrid>
-        <w:gridCol w:w="9648"/>
-      </w:tblGrid>
-      <w:tr>
-        <w:tc>
-          <w:tcPr>
-            <w:tcW w:type="dxa" w:w="9648"/>
-            <w:shd w:fill="F1F5F9"/>
-            <w:tcMar>
-              <w:top w:w="120" w:type="dxa"/>
-              <w:bottom w:w="120" w:type="dxa"/>
-              <w:left w:w="180" w:type="dxa"/>
-              <w:right w:w="180" w:type="dxa"/>
-            </w:tcMar>
-            <w:tcBorders>
-              <w:top w:val="single" w:sz="4" w:space="0" w:color="CBD5E1"/>
-              <w:left w:val="single" w:sz="24" w:space="0" w:color="3B82F6"/>
-              <w:bottom w:val="single" w:sz="4" w:space="0" w:color="CBD5E1"/>
-              <w:right w:val="single" w:sz="4" w:space="0" w:color="CBD5E1"/>
-            </w:tcBorders>
-          </w:tcPr>
-          <w:p>
-            <w:pPr>
-              <w:spacing w:before="0" w:after="0"/>
-            </w:pPr>
-            <w:r>
-              <w:rPr>
-                <w:rFonts w:ascii="Consolas" w:hAnsi="Consolas"/>
-                <w:color w:val="0F172A"/>
-                <w:sz w:val="19"/>
-              </w:rPr>
-              <w:t>public static String removeAccent(String s) {</w:t>
-              <w:br/>
-              <w:t xml:space="preserve">    String temp = Normalizer.normalize(s, Normalizer.Form.NFD);</w:t>
-              <w:br/>
-              <w:t xml:space="preserve">    Pattern pattern = Pattern.compile("\\p{InCombiningDiacriticalMarks}+");</w:t>
-              <w:br/>
-              <w:t xml:space="preserve">    return pattern.matcher(temp).replaceAll("").replace('đ', 'd').replace('Đ', 'D');</w:t>
               <w:br/>
               <w:t>}</w:t>
             </w:r>
@@ -2540,8 +2408,6 @@
                 <w:color w:val="0F172A"/>
                 <w:sz w:val="19"/>
               </w:rPr>
-              <w:t>// Chuẩn hóa tên trạm khí tượng phụ (Xóm Trong, Đình Thôn...) về Hà Nội:</w:t>
-              <w:br/>
               <w:t>public static String cleanLocationName(String rawName) {</w:t>
               <w:br/>
               <w:t xml:space="preserve">    if (rawName == null) return "Hà Nội";</w:t>
@@ -2614,7 +2480,7 @@
                 <w:color w:val="1E293B"/>
                 <w:sz w:val="20"/>
               </w:rPr>
-              <w:t>"Thưa thầy cô, em đảm nhiệm hệ thống định vị vệ tinh toàn cầu GPS và cơ sở dữ liệu tra cứu 63 tỉnh thành Việt Nam. Điểm kỹ thuật nổi bật nhất trong phần của em là em đã giải quyết triệt để lỗi định vị hiển thị tên thôn xóm nhỏ (như Đình Thôn hay Xóm Trong) bằng thuật toán kiểm soát ranh giới tọa độ trong WeatherUtils.java và VietnamLocations.java, luôn đảm bảo hiển thị tên Thành phố trung tâm chuẩn mực. Đồng thời, em xây dựng thanh tìm kiếm thông minh hỗ trợ tìm kiếm tiếng Việt không dấu và lưu trữ lịch sử vào SQLite."</w:t>
+              <w:t>"Thưa thầy cô, em đảm nhiệm hệ thống định vị vệ tinh toàn cầu GPS, cơ sở dữ liệu tra cứu 63 tỉnh thành Việt Nam và mô-đun thiên văn học mặt trời mặt trăng gắn liền với tọa độ địa lý. Điểm kỹ thuật nổi bật nhất trong phần của em là em đã giải quyết triệt để lỗi định vị hiển thị tên thôn xóm nhỏ (như Đình Thôn hay Xóm Trong) bằng thuật toán kiểm soát ranh giới tọa độ trong WeatherUtils.java và VietnamLocations.java, luôn đảm bảo hiển thị tên Thành phố trung tâm chuẩn mực."</w:t>
             </w:r>
           </w:p>
         </w:tc>
@@ -2637,7 +2503,7 @@
           <w:color w:val="2A52BE"/>
           <w:sz w:val="26"/>
         </w:rPr>
-        <w:t>4. Thành Viên 4: BẠN AN THẠCH — Phụ Trách So Sánh Khí Hậu &amp; Cảnh Báo Thiên Tai</w:t>
+        <w:t>4. Thành Viên 4: BẠN AN THẠCH — Phụ Trách So Sánh Khí Hậu, Chi Tiết &amp; Thiên Tai (4 Màn Hình)</w:t>
       </w:r>
     </w:p>
     <w:p>
@@ -2648,7 +2514,7 @@
         <w:t xml:space="preserve">Vai trò chính: </w:t>
       </w:r>
       <w:r>
-        <w:t>Phát triển các công cụ phân tích thời tiết nâng cao phục vụ đời sống: Đối chiếu khí hậu giữa 2 địa phương, hệ thống radar cảnh báo thời tiết cực đoan và trung tâm kỹ năng sinh tồn tích hợp gọi điện cứu hộ khẩn cấp.</w:t>
+        <w:t>Phát triển các công cụ phân tích đối chiếu khí hậu giữa 2 địa phương, tra cứu thông số khí tượng chuyên sâu, hệ thống radar cảnh báo thời tiết nguy hiểm và trung tâm kỹ năng sinh tồn tích hợp gọi điện cứu hộ khẩn cấp.</w:t>
       </w:r>
     </w:p>
     <w:p>
@@ -2656,24 +2522,24 @@
         <w:rPr>
           <w:b/>
         </w:rPr>
-        <w:t>Chi tiết 3 màn hình đảm nhiệm:</w:t>
+        <w:t>Chi tiết 4 màn hình đảm nhiệm (Màn 12 -&gt; Màn 15):</w:t>
         <w:br/>
       </w:r>
       <w:r>
         <w:rPr>
           <w:b/>
         </w:rPr>
-        <w:t xml:space="preserve"> 1. WeatherCompareActivity (Màn hình So Sánh Thời Tiết 2 Địa Điểm): </w:t>
+        <w:t xml:space="preserve"> • Màn 12: WeatherCompareActivity (Màn hình So Sánh Thời Tiết 2 Địa Điểm): </w:t>
       </w:r>
       <w:r>
-        <w:t>Cho phép chọn đồng thời 2 tỉnh thành bất kỳ (VD: Hà Nội và TP.HCM) để so sánh trực quan trên cùng màn hình. Bảng chỉ số đối chiếu: Nhiệt độ, Độ ẩm, Sức gió, Khí áp, Tầm nhìn, Tỷ lệ mây. Tự động tính toán độ chênh lệch nhiệt độ Delta-T để người dùng biết nơi nào nóng hơn, nơi nào ẩm hơn nhằm chuẩn bị hành lý khi đi lại.</w:t>
+        <w:t>Cho phép chọn đồng thời 2 tỉnh thành bất kỳ (VD: Hà Nội và TP.HCM) để so sánh trực quan. Bảng chỉ số đối chiếu: Nhiệt độ, Độ ẩm, Sức gió, Khí áp, Tầm nhìn, Tỷ lệ mây. Tự động tính toán độ chênh lệch nhiệt độ Delta-T để biết nơi nào nóng hơn, ẩm hơn nhằm chuẩn bị hành lý khi di chuyển.</w:t>
         <w:br/>
       </w:r>
       <w:r>
         <w:rPr>
           <w:b/>
         </w:rPr>
-        <w:t xml:space="preserve"> 2. WeatherAlertsActivity (Radar Cảnh Báo Thiên Tai &amp; Thời Tiết Cực Đoan): </w:t>
+        <w:t xml:space="preserve"> • Màn 13: WeatherAlertsActivity (Radar Cảnh Báo Thiên Tai &amp; Thời Tiết Cực Đoan): </w:t>
       </w:r>
       <w:r>
         <w:t>Tiếp nhận và phát tín hiệu cảnh báo dông lốc, mưa lớn ngập lụt, sóng nhiệt nắng nóng, bão nhiệt đới. Phân cấp mức độ nguy hiểm theo 4 cấp màu trực quan: Xanh (Bình thường), Vàng (Chú ý), Cam (Nguy hiểm), Đỏ (Cực kỳ nguy hiểm / Khẩn cấp).</w:t>
@@ -2683,10 +2549,20 @@
         <w:rPr>
           <w:b/>
         </w:rPr>
-        <w:t xml:space="preserve"> 3. DisasterGuideActivity (Cẩm Nang Kỹ Năng Sinh Tồn &amp; Số Cứu Hộ Khẩn Cấp): </w:t>
+        <w:t xml:space="preserve"> • Màn 14: DisasterGuideActivity (Cẩm Nang Kỹ Năng Sinh Tồn &amp; Số Cứu Hộ Khẩn Cấp): </w:t>
       </w:r>
       <w:r>
         <w:t>Cung cấp hướng dẫn sinh tồn khi xảy ra 5 thảm họa thiên nhiên phổ biến: Bão lũ - Lốc xoáy - Sấm sét - Động đất - Hỏa hoạn. Tích hợp nút gọi điện 1 chạm đến các tổng đài cứu nạn quốc gia (112 - Tìm kiếm cứu nạn, 114 - Cứu hỏa cứu nạn, 115 - Cấp cứu y tế).</w:t>
+        <w:br/>
+      </w:r>
+      <w:r>
+        <w:rPr>
+          <w:b/>
+        </w:rPr>
+        <w:t xml:space="preserve"> • Màn 15: DetailActivity (Màn hình Chi Tiết Khí Tượng Chuyên Sâu): </w:t>
+      </w:r>
+      <w:r>
+        <w:t>Cung cấp các thông số kỹ thuật phục vụ cảnh báo thiên tai: Áp suất khí quyển (mbar / inHg), Nhiệt độ điểm sương (Dew Point), Tầm nhìn xa (km / dặm), Tốc độ và hướng gió theo 16 phương vị la bàn.</w:t>
       </w:r>
     </w:p>
     <w:p>
@@ -2877,7 +2753,7 @@
                 <w:color w:val="1E293B"/>
                 <w:sz w:val="20"/>
               </w:rPr>
-              <w:t>"Thưa thầy cô, em phụ trách các tính năng phân tích khí hậu liên vùng và trung tâm an toàn thiên tai. Tính năng So sánh thời tiết của em mang giá trị thực tiễn rất cao cho ngành du lịch và vận tải logistics, cho phép so sánh song song và tính toán độ chênh lệch nhiệt độ giữa 2 miền khí hậu. Đặc biệt, màn hình Cẩm nang sinh tồn của em đã tích hợp sâu vào phần cứng điện thoại bằng Intent.ACTION_DIAL để kết nối trực tiếp đến các đầu số cứu hộ quốc gia 112, 114, 115 giúp bảo vệ an toàn tính mạng người dân."</w:t>
+              <w:t>"Thưa thầy cô, em phụ trách các tính năng phân tích khí hậu liên vùng, tra cứu số liệu khí quyển chuyên sâu và trung tâm an toàn thiên tai. Tính năng So sánh thời tiết của em mang giá trị thực tiễn rất cao cho du lịch và logistics. Đặc biệt, cẩm nang sinh tồn của em đã tích hợp phần cứng bàn phím gọi điện khẩn cấp 112, 114, 115 bằng Intent.ACTION_DIAL kết hợp màn hình DetailActivity hiển thị áp suất khí quyển để cảnh báo sớm vùng áp thấp nhiệt đới."</w:t>
             </w:r>
           </w:p>
         </w:tc>
@@ -2900,7 +2776,7 @@
           <w:color w:val="2A52BE"/>
           <w:sz w:val="26"/>
         </w:rPr>
-        <w:t>5. Thành Viên 5: BẠN DŨNG — Phụ Trách Chất Lượng Không Khí, Sức Khỏe &amp; Cài Đặt Hệ Thống</w:t>
+        <w:t>5. Thành Viên 5: BẠN DŨNG — Phụ Trách Chất Lượng Không Khí, Sức Khỏe &amp; Cài Đặt Hệ Thống (3 Màn Hình)</w:t>
       </w:r>
     </w:p>
     <w:p>
@@ -2911,7 +2787,7 @@
         <w:t xml:space="preserve">Vai trò chính: </w:t>
       </w:r>
       <w:r>
-        <w:t>Xây dựng mô-đun quan trắc môi trường, trợ lý tư vấn sức khỏe phong cách sống và thiết kế kiến trúc nền tảng BaseActivity đồng bộ Dark Mode và Đa ngôn ngữ cho toàn bộ 18 màn hình.</w:t>
+        <w:t>Xây dựng mô-đun quan trắc môi trường AQI, trợ lý tư vấn sức khỏe phong cách sống và thiết kế kiến trúc nền tảng BaseActivity đồng bộ Dark Mode và Đa ngôn ngữ cho toàn bộ 18 màn hình.</w:t>
       </w:r>
     </w:p>
     <w:p>
@@ -2919,14 +2795,14 @@
         <w:rPr>
           <w:b/>
         </w:rPr>
-        <w:t>Chi tiết 4 màn hình đảm nhiệm:</w:t>
+        <w:t>Chi tiết 3 màn hình đảm nhiệm (Màn 16 -&gt; Màn 18):</w:t>
         <w:br/>
       </w:r>
       <w:r>
         <w:rPr>
           <w:b/>
         </w:rPr>
-        <w:t xml:space="preserve"> 1. AirQualityActivity (Màn hình Giám Sát Chất Lượng Không Khí AQI): </w:t>
+        <w:t xml:space="preserve"> • Màn 16: AirQualityActivity (Màn hình Giám Sát Chất Lượng Không Khí AQI): </w:t>
       </w:r>
       <w:r>
         <w:t>Đo lường chỉ số ô nhiễm không khí theo tiêu chuẩn US-EPA Index (thang điểm 1 đến 6). Phân tích chi tiết nồng độ bụi siêu mịn PM2.5, bụi thô PM10, khí độc CO, NO2, SO2, O3 và đưa ra khuyến cáo y tế đeo khẩu trang bảo vệ đường hô hấp.</w:t>
@@ -2936,7 +2812,7 @@
         <w:rPr>
           <w:b/>
         </w:rPr>
-        <w:t xml:space="preserve"> 2. LifestyleAdviceActivity (Trợ Lý Sức Khỏe &amp; Lối Sống Thông Minh): </w:t>
+        <w:t xml:space="preserve"> • Màn 17: LifestyleAdviceActivity (Trợ Lý Sức Khỏe &amp; Lối Sống Thông Minh): </w:t>
       </w:r>
       <w:r>
         <w:t>Đưa ra lời khuyên sinh hoạt cá nhân hóa: Trang phục hôm nay (mặc ấm hay thoáng mát), Khả năng phơi quần áo ngoài trời, Cảnh báo tia cực tím UV và bôi kem chống nắng, Đánh giá điều kiện tập thể thao ngoài trời.</w:t>
@@ -2946,20 +2822,20 @@
         <w:rPr>
           <w:b/>
         </w:rPr>
-        <w:t xml:space="preserve"> 3. DetailActivity (Chi Tiết Khí Tượng Chuyên Sâu): </w:t>
+        <w:t xml:space="preserve"> • Màn 18: SettingsActivity (Cài Đặt Hệ Thống Ứng Dụng): </w:t>
       </w:r>
       <w:r>
-        <w:t>Tra cứu các thông số kỹ thuật: Áp suất khí quyển (mbar / inHg), Nhiệt độ điểm sương (Dew Point), Tầm nhìn xa (km / dặm), Tốc độ và hướng gió theo 16 phương vị la bàn.</w:t>
+        <w:t>Chuyển đổi giao diện Sáng / Tối (Dark Mode); Đổi đơn vị nhiệt độ (°C / °F); Đổi đơn vị gió; Đổi ngôn ngữ toàn bộ app sang Tiếng Việt (VI) hoặc Tiếng Anh (EN).</w:t>
         <w:br/>
       </w:r>
       <w:r>
         <w:rPr>
           <w:b/>
         </w:rPr>
-        <w:t xml:space="preserve"> 4. SettingsActivity (Cài Đặt Hệ Thống Ứng Dụng): </w:t>
+        <w:t xml:space="preserve"> • Lớp kiến trúc nền tảng BaseActivity.java &amp; Tiện ích WeatherUtils.java: </w:t>
       </w:r>
       <w:r>
-        <w:t>Chuyển đổi giao diện Sáng / Tối (Dark Mode); Đổi đơn vị nhiệt độ (°C / °F); Đổi đơn vị gió; Đổi ngôn ngữ toàn bộ app sang Tiếng Việt (VI) hoặc Tiếng Anh (EN).</w:t>
+        <w:t>Xây dựng kiến trúc kế thừa chung cho toàn bộ 18 màn hình, giúp áp dụng Dark Mode và đa ngôn ngữ tự động trên toàn app.</w:t>
       </w:r>
     </w:p>
     <w:p>
@@ -3053,6 +2929,64 @@
     <w:p>
       <w:pPr>
         <w:spacing w:before="40" w:after="40"/>
+      </w:pPr>
+    </w:p>
+    <w:tbl>
+      <w:tblPr>
+        <w:tblW w:type="auto" w:w="0"/>
+        <w:jc w:val="center"/>
+        <w:tblLook w:firstColumn="1" w:firstRow="1" w:lastColumn="0" w:lastRow="0" w:noHBand="0" w:noVBand="1" w:val="04A0"/>
+      </w:tblPr>
+      <w:tblGrid>
+        <w:gridCol w:w="9648"/>
+      </w:tblGrid>
+      <w:tr>
+        <w:tc>
+          <w:tcPr>
+            <w:tcW w:type="dxa" w:w="9648"/>
+            <w:shd w:fill="EFF6FF"/>
+            <w:tcMar>
+              <w:top w:w="140" w:type="dxa"/>
+              <w:bottom w:w="140" w:type="dxa"/>
+              <w:left w:w="200" w:type="dxa"/>
+              <w:right w:w="200" w:type="dxa"/>
+            </w:tcMar>
+            <w:tcBorders>
+              <w:top w:val="none"/>
+              <w:left w:val="single" w:sz="36" w:space="0" w:color="3B82F6"/>
+              <w:bottom w:val="none"/>
+              <w:right w:val="none"/>
+            </w:tcBorders>
+          </w:tcPr>
+          <w:p>
+            <w:pPr>
+              <w:spacing w:before="0" w:after="40"/>
+            </w:pPr>
+            <w:r>
+              <w:rPr>
+                <w:rFonts w:ascii="Arial" w:hAnsi="Arial"/>
+                <w:b/>
+                <w:color w:val="1E3A8A"/>
+                <w:sz w:val="21"/>
+              </w:rPr>
+              <w:t>🎤 Câu nói mẫu giúp bạn Dũng tự tin thuyết trình:</w:t>
+              <w:br/>
+            </w:r>
+            <w:r>
+              <w:rPr>
+                <w:rFonts w:ascii="Arial" w:hAnsi="Arial"/>
+                <w:color w:val="1E293B"/>
+                <w:sz w:val="20"/>
+              </w:rPr>
+              <w:t>"Thưa thầy cô, em phụ trách mảng đo lường chất lượng không khí, chăm sóc sức khỏe cộng đồng và kiến trúc nền tảng của hệ thống. Em đã áp dụng thang đo tiêu chuẩn US-EPA để cảnh báo nồng độ bụi mịn PM2.5 và PM10 cho người dân. Đặc biệt về mặt kỹ thuật, em đã thiết kế lớp BaseActivity.java làm khung xương cho tất cả 18 màn hình, giúp việc chuyển đổi Chế độ Tối (Dark Mode) và Song ngữ Việt - Anh diễn ra hoàn toàn tự động, tức thì và đồng bộ 100% trên toàn ứng dụng."</w:t>
+            </w:r>
+          </w:p>
+        </w:tc>
+      </w:tr>
+    </w:tbl>
+    <w:p>
+      <w:pPr>
+        <w:spacing w:before="40" w:after="80"/>
       </w:pPr>
     </w:p>
     <w:p>
@@ -3462,7 +3396,7 @@
           <w:color w:val="1B365D"/>
           <w:sz w:val="32"/>
         </w:rPr>
-        <w:t>PHẦN V: LIÊN KẾT TẢI VÀ TRẢI NGHIỆM ỨNG DỤNG</w:t>
+        <w:t>PHẦN V: HƯỚNG DẪN CÀI ĐẶT TRÊN ĐIỆN THOẠI &amp; LIÊN KẾT TẢI APP</w:t>
       </w:r>
     </w:p>
     <w:p>
@@ -3470,7 +3404,14 @@
         <w:rPr>
           <w:b/>
         </w:rPr>
-        <w:t xml:space="preserve"> • Link tải file APK bản mới nhất (cho điện thoại Android): </w:t>
+        <w:t>1. Các đường link chính thức của dự án:</w:t>
+        <w:br/>
+      </w:r>
+      <w:r>
+        <w:rPr>
+          <w:b/>
+        </w:rPr>
+        <w:t xml:space="preserve"> • Link tải file APK mới nhất (dành cho điện thoại Android): </w:t>
       </w:r>
       <w:r>
         <w:t>https://datsvipff92617-ux.github.io/DuBaoThoiTiet/DuBaoThoiTiet.apk</w:t>
@@ -3480,7 +3421,7 @@
         <w:rPr>
           <w:b/>
         </w:rPr>
-        <w:t xml:space="preserve"> • Link trải nghiệm trực tiếp trên Web / iPhone (PWA): </w:t>
+        <w:t xml:space="preserve"> • Link bản Web App / PWA (Dùng trực tiếp trên cả Android và iPhone không cần cài đặt): </w:t>
       </w:r>
       <w:r>
         <w:t>https://datsvipff92617-ux.github.io/DuBaoThoiTiet/</w:t>
@@ -3490,11 +3431,169 @@
         <w:rPr>
           <w:b/>
         </w:rPr>
-        <w:t xml:space="preserve"> • Kho lưu trữ mã nguồn GitHub chính thức: </w:t>
+        <w:t xml:space="preserve"> • Link kho mã nguồn GitHub chính thức: </w:t>
       </w:r>
       <w:r>
         <w:t>https://github.com/datsvipff92617-ux/DuBaoThoiTiet</w:t>
         <w:br/>
+      </w:r>
+    </w:p>
+    <w:p>
+      <w:pPr>
+        <w:pStyle w:val="Heading2"/>
+        <w:keepNext/>
+        <w:spacing w:before="240" w:after="120"/>
+      </w:pPr>
+      <w:r>
+        <w:rPr>
+          <w:b/>
+          <w:color w:val="2A52BE"/>
+          <w:sz w:val="26"/>
+        </w:rPr>
+        <w:t>2. Hướng dẫn cách tải và cài đặt trực tiếp trên điện thoại Android:</w:t>
+      </w:r>
+    </w:p>
+    <w:p>
+      <w:r>
+        <w:rPr>
+          <w:b/>
+        </w:rPr>
+        <w:t xml:space="preserve"> • Cách 1 (Khuyên dùng - Nhanh nhất): </w:t>
+      </w:r>
+      <w:r>
+        <w:t xml:space="preserve">Mở trình duyệt Chrome trên điện thoại, truy cập trang web: </w:t>
+      </w:r>
+      <w:r>
+        <w:rPr>
+          <w:b/>
+        </w:rPr>
+        <w:t>https://datsvipff92617-ux.github.io/DuBaoThoiTiet/</w:t>
+      </w:r>
+      <w:r>
+        <w:t xml:space="preserve">. Kéo xuống dưới chân trang sẽ thấy nút bấm màu xanh: </w:t>
+      </w:r>
+      <w:r>
+        <w:rPr>
+          <w:b/>
+        </w:rPr>
+        <w:t>📲 Tải file APK (Android) Bản Mới Nhất</w:t>
+      </w:r>
+      <w:r>
+        <w:t>. Bấm vào nút này, tệp DuBaoThoiTiet.apk sẽ tự động tải về thư mục Tải về (Download) của điện thoại.</w:t>
+        <w:br/>
+        <w:br/>
+      </w:r>
+      <w:r>
+        <w:rPr>
+          <w:b/>
+        </w:rPr>
+        <w:t xml:space="preserve"> • Cách 2 (Tải trực tiếp qua link APK): </w:t>
+      </w:r>
+      <w:r>
+        <w:t xml:space="preserve">Gửi đường link </w:t>
+      </w:r>
+      <w:r>
+        <w:rPr>
+          <w:b/>
+        </w:rPr>
+        <w:t>https://datsvipff92617-ux.github.io/DuBaoThoiTiet/DuBaoThoiTiet.apk</w:t>
+      </w:r>
+      <w:r>
+        <w:t xml:space="preserve"> qua tin nhắn Zalo/Messenger của bạn bè hoặc chính mình, sau đó bấm vào link trên điện thoại để bắt đầu tải về.</w:t>
+        <w:br/>
+        <w:br/>
+      </w:r>
+      <w:r>
+        <w:rPr>
+          <w:b/>
+        </w:rPr>
+        <w:t xml:space="preserve"> • Cách 3 (Vượt qua cảnh báo Google Play Protect khi cài đặt): </w:t>
+      </w:r>
+      <w:r>
+        <w:t xml:space="preserve">Sau khi tải file APK về điện thoại, bấm Mở tệp để cài đặt. Nếu điện thoại hiện thông báo 'Bị chặn bởi Play Protect', hãy bấm vào dòng chữ nhỏ </w:t>
+      </w:r>
+      <w:r>
+        <w:rPr>
+          <w:b/>
+        </w:rPr>
+        <w:t>'Chi tiết khác' (More details)</w:t>
+      </w:r>
+      <w:r>
+        <w:t xml:space="preserve"> ➔ Chọn </w:t>
+      </w:r>
+      <w:r>
+        <w:rPr>
+          <w:b/>
+        </w:rPr>
+        <w:t>'Vẫn cài đặt' (Install anyway)</w:t>
+      </w:r>
+      <w:r>
+        <w:t xml:space="preserve"> là ứng dụng sẽ được cài thành công 100% lên màn hình chính điện thoại!</w:t>
+        <w:br/>
+        <w:br/>
+      </w:r>
+      <w:r>
+        <w:rPr>
+          <w:b/>
+        </w:rPr>
+        <w:t xml:space="preserve"> • Lưu ý về gỡ phiên bản cũ: </w:t>
+      </w:r>
+      <w:r>
+        <w:t>Nếu trên máy của bạn đã từng cài một bản app cũ trước đó, hãy gỡ cài đặt (xóa app cũ) trước, sau đó mới cài bản mới để không bị lỗi xung đột gói ứng dụng.</w:t>
+      </w:r>
+    </w:p>
+    <w:p>
+      <w:pPr>
+        <w:pStyle w:val="Heading2"/>
+        <w:keepNext/>
+        <w:spacing w:before="240" w:after="120"/>
+      </w:pPr>
+      <w:r>
+        <w:rPr>
+          <w:b/>
+          <w:color w:val="2A52BE"/>
+          <w:sz w:val="26"/>
+        </w:rPr>
+        <w:t>3. Hướng dẫn sử dụng cho điện thoại iPhone (iOS):</w:t>
+      </w:r>
+    </w:p>
+    <w:p>
+      <w:r>
+        <w:t>Điện thoại iPhone chạy hệ điều hành iOS nên không chạy được tệp đuôi .apk. Tuy nhiên, nhóm đã xây dựng bản Web PWA tương thích hoàn hảo:</w:t>
+        <w:br/>
+      </w:r>
+      <w:r>
+        <w:t xml:space="preserve"> • Bước 1: Mở trình duyệt Safari trên iPhone, vào link: https://datsvipff92617-ux.github.io/DuBaoThoiTiet/</w:t>
+        <w:br/>
+      </w:r>
+      <w:r>
+        <w:t xml:space="preserve"> • Bước 2: Bấm vào nút </w:t>
+      </w:r>
+      <w:r>
+        <w:rPr>
+          <w:b/>
+        </w:rPr>
+        <w:t>Chia sẻ (Share) 📤</w:t>
+      </w:r>
+      <w:r>
+        <w:t xml:space="preserve"> ở thanh công cụ dưới cùng của Safari.</w:t>
+        <w:br/>
+      </w:r>
+      <w:r>
+        <w:t xml:space="preserve"> • Bước 3: Cuộn xuống chọn </w:t>
+      </w:r>
+      <w:r>
+        <w:rPr>
+          <w:b/>
+        </w:rPr>
+        <w:t>'Thêm vào Màn hình chính' (Add to Home Screen)</w:t>
+      </w:r>
+      <w:r>
+        <w:t xml:space="preserve"> ➔ Bấm 'Thêm' (Add).</w:t>
+        <w:br/>
+      </w:r>
+      <w:r>
+        <w:t>Ngay lập tức, icon Thời Tiết sẽ xuất hiện ngoài màn hình chính của iPhone, bấm vào sẽ chạy toàn màn hình, mượt mà và đầy đủ tính năng y hệt như app tải từ App Store!</w:t>
       </w:r>
     </w:p>
     <w:sectPr>

</xml_diff>